<commit_message>
Record author-reported ethics determination with private completion
</commit_message>
<xml_diff>
--- a/research/REVISED_PILOT_MANUSCRIPT.docx
+++ b/research/REVISED_PILOT_MANUSCRIPT.docx
@@ -16,7 +16,7 @@
         <w:pStyle w:val="FirstParagraph"/>
       </w:pPr>
       <w:r>
-        <w:t xml:space="preserve">Research manuscript draft, 7 October 2026. Completed exploratory experiments on checksum-verified RMHD version 1, including frozen July/August evaluation and training-account resampling. The author reports that an ethics determination exists; its reviewing body, reference, date and scope await documentation. Human author, affiliation, contribution, funding/conflict and disclosure statements also require completion. This replacement study does not claim reproduction of arXiv:2601.11758v1.</w:t>
+        <w:t xml:space="preserve">Research manuscript draft, 7 October 2026. Completed exploratory experiments on checksum-verified RMHD version 1, including frozen July/August evaluation and training-account resampling. The author reports that an ethics determination exists and withholds its details here; the authors will complete the required ethics information privately in their submission copy. Human author, affiliation, contribution, funding/conflict and disclosure statements also require completion. This replacement study does not claim reproduction of arXiv:2601.11758v1.</w:t>
       </w:r>
     </w:p>
     <w:bookmarkStart w:id="20" w:name="abstract"/>
@@ -2240,7 +2240,7 @@
         <w:pStyle w:val="FirstParagraph"/>
       </w:pPr>
       <w:r>
-        <w:t xml:space="preserve">The source study reports Victoria University Human Research Ethics Committee approval HRE23-005, dated 29 May 2023 [1]. This approval belongs to the original study and is not assigned to the present secondary analysis. The present author reports that an institutional determination exists; the reviewing body, decision, reference, date and applicable scope have not yet been provided for this draft. These factual details must replace this status statement before submission. No current-project approval number, exemption or consent basis is inferred. The publisher states CC0 for RMHD version 1, which establishes the stated source license without establishing the secondary study’s institutional determination.</w:t>
+        <w:t xml:space="preserve">The source study reports Victoria University Human Research Ethics Committee approval HRE23-005, dated 29 May 2023 [1]. This approval belongs to the original study and is not assigned to the present secondary analysis. The present author reports that an institutional determination exists and that its details cannot be shared in this chat. The documents have not been independently reviewed in preparing this draft. The authors will insert the reviewing body, actual decision, reference if issued, date and applicable scope privately into their submission copy, following the target journal’s reporting requirements. This status statement is not the final journal ethics declaration. No current-project approval number, exemption or consent basis is inferred. The publisher states CC0 for RMHD version 1, which establishes the stated source license without establishing the secondary study’s institutional determination.</w:t>
       </w:r>
     </w:p>
     <w:p>

</xml_diff>

<commit_message>
Clarify prior-work overlap and bounded submission readiness
</commit_message>
<xml_diff>
--- a/research/REVISED_PILOT_MANUSCRIPT.docx
+++ b/research/REVISED_PILOT_MANUSCRIPT.docx
@@ -2,13 +2,13 @@
 <file path=word/document.xml><?xml version="1.0" encoding="utf-8"?>
 <w:document xmlns:w="http://schemas.openxmlformats.org/wordprocessingml/2006/main" xmlns:m="http://schemas.openxmlformats.org/officeDocument/2006/math" xmlns:r="http://schemas.openxmlformats.org/officeDocument/2006/relationships" xmlns:o="urn:schemas-microsoft-com:office:office" xmlns:v="urn:schemas-microsoft-com:vml" xmlns:w10="urn:schemas-microsoft-com:office:word" xmlns:a="http://schemas.openxmlformats.org/drawingml/2006/main" xmlns:pic="http://schemas.openxmlformats.org/drawingml/2006/picture" xmlns:wp="http://schemas.openxmlformats.org/drawingml/2006/wordprocessingDrawing">
   <w:body>
-    <w:bookmarkStart w:id="46" w:name="X5f6619b91f857729e3fe37d908d0e3c6706af9f"/>
+    <w:bookmarkStart w:id="52" w:name="Xb6ad41fcf37b1c5299476dbb24a327247904961"/>
     <w:p>
       <w:pPr>
         <w:pStyle w:val="Heading1"/>
       </w:pPr>
       <w:r>
-        <w:t xml:space="preserve">Comparator dependence of linguistic and lexical models for anxiety-community language on Reddit</w:t>
+        <w:t xml:space="preserve">Linguistic and lexical models for anxiety-community language: a temporal robustness study in RMHD</w:t>
       </w:r>
     </w:p>
     <w:p>
@@ -59,7 +59,7 @@
         <w:pStyle w:val="BodyText"/>
       </w:pPr>
       <w:r>
-        <w:t xml:space="preserve">Low-dimensional sentiment and pronoun features are inexpensive and readily inspected. Their interpretation is nevertheless ambiguous: they may reflect autobiographical genre, topic or help-seeking conventions shared across mental-health communities. Ireland and Iserman [8] already compared anxiety-forum members’ language within and outside support contexts, using dictionary and word features with held-out users. Prior anxiety/panic research also combines lexical and emotion analysis [4], and multi-dataset depression research evaluates lexical and lexicon representations under temporal and domain shift [7]. Neither interpretable features, transfer failure nor anxiety-community classification is novel by itself. The relevant question is how these signals behave when comparison communities discuss other mental-health concerns and evaluation moves to unseen accounts in later months.</w:t>
+        <w:t xml:space="preserve">Low-dimensional sentiment and pronoun features are inexpensive and readily inspected. Their interpretation is nevertheless ambiguous: they may reflect autobiographical genre, topic or help-seeking conventions shared across mental-health communities. Shen and Rudzicz [9] already compared lexicon, n-gram, topic and embedding representations for anxiety-related Reddit posts; anxiety/panic comparisons also combine lexical and emotion analysis [4]. Ireland and Iserman [8] compared anxiety-forum members’ language within and outside support contexts, with held-out users. Pirina and Çöltekin [10] demonstrated dependence on training/control corpora and evaluated different source models on a common target test set. Multi-dataset depression research evaluates lexical and lexicon representations under temporal and domain shift [7], while recent work audits lexical/style channels and proxy-label effects [13]. Neither interpretable features, transfer failure nor anxiety-community classification is novel by itself. The relevant question here is how a specific small representation behaves against lexical content when comparison communities discuss other mental-health concerns and evaluation moves to unseen accounts in later months.</w:t>
       </w:r>
     </w:p>
     <w:p>
@@ -67,7 +67,7 @@
         <w:pStyle w:val="BodyText"/>
       </w:pPr>
       <w:r>
-        <w:t xml:space="preserve">This exploratory study asks whether a fixed 13-feature representation distinguishes anxiety-community affiliation beyond simple length/pronoun baselines, how it compares with lexical content, and whether these results persist under length/activity restrictions, keyword perturbations, frozen later-period evaluation and training-account resampling. The incremental contribution is an audited RMHD case study combining adjacent-community comparisons with identical-target transfer, operating-point and representation checks. We study two related contrasts without treating general-interest posts as healthy-person controls. We do not infer diagnosis, clinical screening utility, psychological mechanism or pre-onset risk.</w:t>
+        <w:t xml:space="preserve">This exploratory study asks whether a fixed 13-feature representation distinguishes anxiety-community affiliation beyond simple length/pronoun baselines, how it compares with lexical content, and whether these results persist under length/activity restrictions, keyword perturbations, frozen later-period evaluation and training-account resampling. It is an empirical replication and extension of established context and validity concerns in a specific release, not a new classification method. Its contribution is the measured representation gap and its stability in audited RMHD account cohorts, with adjacent-community comparisons, identical-target transfer, operating-point and representation checks. We study two related contrasts without treating general-interest posts as healthy-person controls. We do not infer diagnosis, clinical screening utility, psychological mechanism or pre-onset risk.</w:t>
       </w:r>
     </w:p>
     <w:bookmarkEnd w:id="21"/>
@@ -416,7 +416,7 @@
         <w:pStyle w:val="BodyText"/>
       </w:pPr>
       <w:r>
-        <w:t xml:space="preserve">Second, the frozen TF-IDF model evaluates June text after neutral-token replacement of 22 prespecified disorder/community terms. This finite-list perturbation does not remove all topical language and does not retrain the model. A separate 13-feature sensitivity uses the original 16-term list. Different masks prevent interpreting their score changes as identical interventions.</w:t>
+        <w:t xml:space="preserve">Second, the frozen TF-IDF model evaluates June text after neutral-token replacement of 22 prespecified disorder/community terms. Topic restrictions and selective masking have established precedents [11,14]; our finite-list frozen-inference perturbation is a sensitivity check, not a new masking method. It does not remove all topical language or retrain the model. A separate 13-feature sensitivity uses the original 16-term list. Different masks prevent interpreting their score changes as identical interventions.</w:t>
       </w:r>
     </w:p>
     <w:p>
@@ -2214,6 +2214,14 @@
         <w:pStyle w:val="BodyText"/>
       </w:pPr>
       <w:r>
+        <w:t xml:space="preserve">The interpretation also has close precedents in common-target corpus comparisons [10] and topic-dependent sentiment/linguistic analysis [12]. Hassan [13] compares lexical, structural and 154-feature style channels under different stress-label sources, with masking and domain checks; a richer style representation can show different rankings from the 13 features used here. Consequently, our lexical advantage is specific to this representation, outcome and cohort policy. The added evidence is its size and short-term persistence in one source, not a general superiority of lexical models, a first demonstration of proxy-label bias, or validation of a new diagnostic marker.</w:t>
+      </w:r>
+    </w:p>
+    <w:p>
+      <w:pPr>
+        <w:pStyle w:val="BodyText"/>
+      </w:pPr>
+      <w:r>
         <w:t xml:space="preserve">The chief limitations are sampling coverage, exclusive-affiliation selection, unknown activity outside the collected communities, account rather than person independence, potential bots/multiple accounts, unverified language suitability, absent original post IDs, unresolved semantic paraphrases and dependent comparisons from one source. Release identity is verified, but the raw export count is not a verified unique-post count and one Numbers file is outside parsed historical coverage. English-oriented feature tools are not independent language verification. Initial June analyses include explicitly post-hoc checks; the later-period protocol was fixed before inspecting those outcomes but after learning from June, without preregistration. Fixed-model bootstrap intervals omit training and label uncertainty. Training resampling probes one component of fitting variability while leaving label validity, source collection and model-selection uncertainty unresolved. Coarse matching changes prevalence and population, and keyword replacement can introduce distribution shift. The short time separation and one-source design do not establish external generalization.</w:t>
       </w:r>
     </w:p>
@@ -2288,7 +2296,7 @@
       </w:r>
     </w:p>
     <w:bookmarkEnd w:id="36"/>
-    <w:bookmarkStart w:id="45" w:name="references"/>
+    <w:bookmarkStart w:id="51" w:name="references"/>
     <w:p>
       <w:pPr>
         <w:pStyle w:val="Heading2"/>
@@ -2544,8 +2552,242 @@
         <w:t xml:space="preserve">.</w:t>
       </w:r>
     </w:p>
-    <w:bookmarkEnd w:id="45"/>
-    <w:bookmarkEnd w:id="46"/>
+    <w:p>
+      <w:pPr>
+        <w:pStyle w:val="Compact"/>
+        <w:numPr>
+          <w:ilvl w:val="0"/>
+          <w:numId w:val="1001"/>
+        </w:numPr>
+      </w:pPr>
+      <w:r>
+        <w:t xml:space="preserve">Shen JH, Rudzicz F. Detecting Anxiety through Reddit.</w:t>
+      </w:r>
+      <w:r>
+        <w:t xml:space="preserve"> </w:t>
+      </w:r>
+      <w:r>
+        <w:rPr>
+          <w:i/>
+          <w:iCs/>
+        </w:rPr>
+        <w:t xml:space="preserve">CLPsych</w:t>
+      </w:r>
+      <w:r>
+        <w:t xml:space="preserve">. 2017;58–65.</w:t>
+      </w:r>
+      <w:r>
+        <w:t xml:space="preserve"> </w:t>
+      </w:r>
+      <w:hyperlink r:id="rId45">
+        <w:r>
+          <w:rPr>
+            <w:rStyle w:val="Hyperlink"/>
+          </w:rPr>
+          <w:t xml:space="preserve">ACL W17-3107</w:t>
+        </w:r>
+      </w:hyperlink>
+      <w:r>
+        <w:t xml:space="preserve">.</w:t>
+      </w:r>
+    </w:p>
+    <w:p>
+      <w:pPr>
+        <w:pStyle w:val="Compact"/>
+        <w:numPr>
+          <w:ilvl w:val="0"/>
+          <w:numId w:val="1001"/>
+        </w:numPr>
+      </w:pPr>
+      <w:r>
+        <w:t xml:space="preserve">Pirina I, Çöltekin Ç. Identifying Depression on Reddit: The Effect of Training Data.</w:t>
+      </w:r>
+      <w:r>
+        <w:t xml:space="preserve"> </w:t>
+      </w:r>
+      <w:r>
+        <w:rPr>
+          <w:i/>
+          <w:iCs/>
+        </w:rPr>
+        <w:t xml:space="preserve">SMM4H</w:t>
+      </w:r>
+      <w:r>
+        <w:t xml:space="preserve">. 2018;9–12.</w:t>
+      </w:r>
+      <w:r>
+        <w:t xml:space="preserve"> </w:t>
+      </w:r>
+      <w:hyperlink r:id="rId46">
+        <w:r>
+          <w:rPr>
+            <w:rStyle w:val="Hyperlink"/>
+          </w:rPr>
+          <w:t xml:space="preserve">ACL W18-5903</w:t>
+        </w:r>
+      </w:hyperlink>
+      <w:r>
+        <w:t xml:space="preserve">.</w:t>
+      </w:r>
+    </w:p>
+    <w:p>
+      <w:pPr>
+        <w:pStyle w:val="Compact"/>
+        <w:numPr>
+          <w:ilvl w:val="0"/>
+          <w:numId w:val="1001"/>
+        </w:numPr>
+      </w:pPr>
+      <w:r>
+        <w:t xml:space="preserve">Pananookooln C, Akaranee J, Silpasuwanchai C. Comparing Selective Masking Methods for Depression Detection in Social Media.</w:t>
+      </w:r>
+      <w:r>
+        <w:t xml:space="preserve"> </w:t>
+      </w:r>
+      <w:r>
+        <w:rPr>
+          <w:i/>
+          <w:iCs/>
+        </w:rPr>
+        <w:t xml:space="preserve">Computational Linguistics</w:t>
+      </w:r>
+      <w:r>
+        <w:t xml:space="preserve">. 2023;49(3):525–553.</w:t>
+      </w:r>
+      <w:r>
+        <w:t xml:space="preserve"> </w:t>
+      </w:r>
+      <w:hyperlink r:id="rId47">
+        <w:r>
+          <w:rPr>
+            <w:rStyle w:val="Hyperlink"/>
+          </w:rPr>
+          <w:t xml:space="preserve">ACL 2023.cl-3.1</w:t>
+        </w:r>
+      </w:hyperlink>
+      <w:r>
+        <w:t xml:space="preserve">.</w:t>
+      </w:r>
+    </w:p>
+    <w:p>
+      <w:pPr>
+        <w:pStyle w:val="Compact"/>
+        <w:numPr>
+          <w:ilvl w:val="0"/>
+          <w:numId w:val="1001"/>
+        </w:numPr>
+      </w:pPr>
+      <w:r>
+        <w:t xml:space="preserve">Sharma N, Sirts K. Context is Important in Depressive Language: A Study of the Interaction Between the Sentiments and Linguistic Markers in Reddit Discussions.</w:t>
+      </w:r>
+      <w:r>
+        <w:t xml:space="preserve"> </w:t>
+      </w:r>
+      <w:r>
+        <w:rPr>
+          <w:i/>
+          <w:iCs/>
+        </w:rPr>
+        <w:t xml:space="preserve">WASSA</w:t>
+      </w:r>
+      <w:r>
+        <w:t xml:space="preserve">. 2024;344–361.</w:t>
+      </w:r>
+      <w:r>
+        <w:t xml:space="preserve"> </w:t>
+      </w:r>
+      <w:hyperlink r:id="rId48">
+        <w:r>
+          <w:rPr>
+            <w:rStyle w:val="Hyperlink"/>
+          </w:rPr>
+          <w:t xml:space="preserve">ACL 2024.wassa-1.28</w:t>
+        </w:r>
+      </w:hyperlink>
+      <w:r>
+        <w:t xml:space="preserve">.</w:t>
+      </w:r>
+    </w:p>
+    <w:p>
+      <w:pPr>
+        <w:pStyle w:val="Compact"/>
+        <w:numPr>
+          <w:ilvl w:val="0"/>
+          <w:numId w:val="1001"/>
+        </w:numPr>
+      </w:pPr>
+      <w:r>
+        <w:t xml:space="preserve">Hassan MY. The Divergence Hypothesis: Unmasking Lexical Interference and Label Bias in Mental Health NLP.</w:t>
+      </w:r>
+      <w:r>
+        <w:t xml:space="preserve"> </w:t>
+      </w:r>
+      <w:r>
+        <w:rPr>
+          <w:i/>
+          <w:iCs/>
+        </w:rPr>
+        <w:t xml:space="preserve">BioNLP</w:t>
+      </w:r>
+      <w:r>
+        <w:t xml:space="preserve">. 2026;1–14.</w:t>
+      </w:r>
+      <w:r>
+        <w:t xml:space="preserve"> </w:t>
+      </w:r>
+      <w:hyperlink r:id="rId49">
+        <w:r>
+          <w:rPr>
+            <w:rStyle w:val="Hyperlink"/>
+          </w:rPr>
+          <w:t xml:space="preserve">ACL 2026.bionlp-1.1</w:t>
+        </w:r>
+      </w:hyperlink>
+      <w:r>
+        <w:t xml:space="preserve">.</w:t>
+      </w:r>
+    </w:p>
+    <w:p>
+      <w:pPr>
+        <w:pStyle w:val="Compact"/>
+        <w:numPr>
+          <w:ilvl w:val="0"/>
+          <w:numId w:val="1001"/>
+        </w:numPr>
+      </w:pPr>
+      <w:r>
+        <w:t xml:space="preserve">Wolohan JT, Hiraga M, Mukherjee A, Sayyed ZA, Millard M. Detecting Linguistic Traces of Depression in Topic-Restricted Text: Attending to Self-Stigmatized Depression with NLP.</w:t>
+      </w:r>
+      <w:r>
+        <w:t xml:space="preserve"> </w:t>
+      </w:r>
+      <w:r>
+        <w:rPr>
+          <w:i/>
+          <w:iCs/>
+        </w:rPr>
+        <w:t xml:space="preserve">Language Cognition and Computational Models</w:t>
+      </w:r>
+      <w:r>
+        <w:t xml:space="preserve">. 2018;11–21.</w:t>
+      </w:r>
+      <w:r>
+        <w:t xml:space="preserve"> </w:t>
+      </w:r>
+      <w:hyperlink r:id="rId50">
+        <w:r>
+          <w:rPr>
+            <w:rStyle w:val="Hyperlink"/>
+          </w:rPr>
+          <w:t xml:space="preserve">ACL W18-4102</w:t>
+        </w:r>
+      </w:hyperlink>
+      <w:r>
+        <w:t xml:space="preserve">.</w:t>
+      </w:r>
+    </w:p>
+    <w:bookmarkEnd w:id="51"/>
+    <w:bookmarkEnd w:id="52"/>
     <w:sectPr/>
   </w:body>
 </w:document>

</xml_diff>

<commit_message>
Assess Elsevier journal fit and document publisher access limits
</commit_message>
<xml_diff>
--- a/research/REVISED_PILOT_MANUSCRIPT.docx
+++ b/research/REVISED_PILOT_MANUSCRIPT.docx
@@ -2,7 +2,7 @@
 <file path=word/document.xml><?xml version="1.0" encoding="utf-8"?>
 <w:document xmlns:w="http://schemas.openxmlformats.org/wordprocessingml/2006/main" xmlns:m="http://schemas.openxmlformats.org/officeDocument/2006/math" xmlns:r="http://schemas.openxmlformats.org/officeDocument/2006/relationships" xmlns:o="urn:schemas-microsoft-com:office:office" xmlns:v="urn:schemas-microsoft-com:vml" xmlns:w10="urn:schemas-microsoft-com:office:word" xmlns:a="http://schemas.openxmlformats.org/drawingml/2006/main" xmlns:pic="http://schemas.openxmlformats.org/drawingml/2006/picture" xmlns:wp="http://schemas.openxmlformats.org/drawingml/2006/wordprocessingDrawing">
   <w:body>
-    <w:bookmarkStart w:id="52" w:name="Xb6ad41fcf37b1c5299476dbb24a327247904961"/>
+    <w:bookmarkStart w:id="54" w:name="Xb6ad41fcf37b1c5299476dbb24a327247904961"/>
     <w:p>
       <w:pPr>
         <w:pStyle w:val="Heading1"/>
@@ -59,7 +59,7 @@
         <w:pStyle w:val="BodyText"/>
       </w:pPr>
       <w:r>
-        <w:t xml:space="preserve">Low-dimensional sentiment and pronoun features are inexpensive and readily inspected. Their interpretation is nevertheless ambiguous: they may reflect autobiographical genre, topic or help-seeking conventions shared across mental-health communities. Shen and Rudzicz [9] already compared lexicon, n-gram, topic and embedding representations for anxiety-related Reddit posts; anxiety/panic comparisons also combine lexical and emotion analysis [4]. Ireland and Iserman [8] compared anxiety-forum members’ language within and outside support contexts, with held-out users. Pirina and Çöltekin [10] demonstrated dependence on training/control corpora and evaluated different source models on a common target test set. Multi-dataset depression research evaluates lexical and lexicon representations under temporal and domain shift [7], while recent work audits lexical/style channels and proxy-label effects [13]. Neither interpretable features, transfer failure nor anxiety-community classification is novel by itself. The relevant question here is how a specific small representation behaves against lexical content when comparison communities discuss other mental-health concerns and evaluation moves to unseen accounts in later months.</w:t>
+        <w:t xml:space="preserve">Low-dimensional sentiment and pronoun features are inexpensive and readily inspected. Their interpretation is nevertheless ambiguous: they may reflect autobiographical genre, topic or help-seeking conventions shared across mental-health communities. Shen and Rudzicz [9] already compared lexicon, n-gram, topic and embedding representations for anxiety-related Reddit posts; anxiety/panic comparisons also combine lexical and emotion analysis [4]. Ireland and Iserman [8] compared anxiety-forum members’ language within and outside support contexts, with held-out users. Pirina and Çöltekin [10] demonstrated dependence on training/control corpora and evaluated different source models on a common target test set. Multi-dataset depression research evaluates lexical and lexicon representations under temporal and domain shift [7], while recent work audits lexical/style channels and proxy-label effects [13]. Related user-level depression work compares temporal semantic and symptom/activity features, with dataset-dependent usefulness [15]. Neither interpretable features, transfer failure nor anxiety-community classification is novel by itself. The relevant question here is how a specific small representation behaves against lexical content when comparison communities discuss other mental-health concerns and evaluation moves to unseen accounts in later months.</w:t>
       </w:r>
     </w:p>
     <w:p>
@@ -2296,7 +2296,7 @@
       </w:r>
     </w:p>
     <w:bookmarkEnd w:id="36"/>
-    <w:bookmarkStart w:id="51" w:name="references"/>
+    <w:bookmarkStart w:id="53" w:name="references"/>
     <w:p>
       <w:pPr>
         <w:pStyle w:val="Heading2"/>
@@ -2786,8 +2786,61 @@
         <w:t xml:space="preserve">.</w:t>
       </w:r>
     </w:p>
-    <w:bookmarkEnd w:id="51"/>
-    <w:bookmarkEnd w:id="52"/>
+    <w:p>
+      <w:pPr>
+        <w:pStyle w:val="Compact"/>
+        <w:numPr>
+          <w:ilvl w:val="0"/>
+          <w:numId w:val="1001"/>
+        </w:numPr>
+      </w:pPr>
+      <w:r>
+        <w:t xml:space="preserve">Farruque N, Goebel R, Sivapalan S, Zaïane OR. Deep temporal modelling of clinical depression through social media text.</w:t>
+      </w:r>
+      <w:r>
+        <w:t xml:space="preserve"> </w:t>
+      </w:r>
+      <w:r>
+        <w:rPr>
+          <w:i/>
+          <w:iCs/>
+        </w:rPr>
+        <w:t xml:space="preserve">Natural Language Processing Journal</w:t>
+      </w:r>
+      <w:r>
+        <w:t xml:space="preserve">. 2024.</w:t>
+      </w:r>
+      <w:r>
+        <w:t xml:space="preserve"> </w:t>
+      </w:r>
+      <w:hyperlink r:id="rId51">
+        <w:r>
+          <w:rPr>
+            <w:rStyle w:val="Hyperlink"/>
+          </w:rPr>
+          <w:t xml:space="preserve">doi:10.1016/j.nlp.2023.100052</w:t>
+        </w:r>
+      </w:hyperlink>
+      <w:r>
+        <w:t xml:space="preserve">.</w:t>
+      </w:r>
+      <w:r>
+        <w:t xml:space="preserve"> </w:t>
+      </w:r>
+      <w:hyperlink r:id="rId52">
+        <w:r>
+          <w:rPr>
+            <w:rStyle w:val="Hyperlink"/>
+          </w:rPr>
+          <w:t xml:space="preserve">Author preprint v3</w:t>
+        </w:r>
+      </w:hyperlink>
+      <w:r>
+        <w:t xml:space="preserve">.</w:t>
+      </w:r>
+    </w:p>
+    <w:bookmarkEnd w:id="53"/>
+    <w:bookmarkEnd w:id="54"/>
     <w:sectPr/>
   </w:body>
 </w:document>

</xml_diff>